<commit_message>
Finalize SStE manuscript for submission: English-only text and figure-less DOCX.
Strip embedded figures, remove legend artifacts, fix NDB naming and Data Availability, and add presubmission verification tooling.

Co-authored-by: Cursor <cursoragent@cursor.com>
</commit_message>
<xml_diff>
--- a/04_Manuscripts/How_Spatial_Dependence_Alters_Ecological_Interpretation_20260619.docx
+++ b/04_Manuscripts/How_Spatial_Dependence_Alters_Ecological_Interpretation_20260619.docx
@@ -36,35 +36,6 @@
           <w:lang w:eastAsia="ja-JP"/>
         </w:rPr>
         <w:t>Tetsuya Ohira</w:t>
-      </w:r>
-    </w:p>
-    <w:p>
-      <w:pPr>
-        <w:pStyle w:val="a8"/>
-        <w:rPr>
-          <w:rFonts w:hint="eastAsia"/>
-          <w:lang w:eastAsia="ja-JP"/>
-        </w:rPr>
-      </w:pPr>
-      <w:r>
-        <w:t>2026-0</w:t>
-      </w:r>
-      <w:r>
-        <w:rPr>
-          <w:rFonts w:hint="eastAsia"/>
-          <w:lang w:eastAsia="ja-JP"/>
-        </w:rPr>
-        <w:t>6</w:t>
-      </w:r>
-      <w:r>
-        <w:t>-</w:t>
-      </w:r>
-      <w:r>
-        <w:rPr>
-          <w:rFonts w:hint="eastAsia"/>
-          <w:lang w:eastAsia="ja-JP"/>
-        </w:rPr>
-        <w:t>19</w:t>
       </w:r>
     </w:p>
     <w:p>
@@ -246,22 +217,7 @@
         <w:pStyle w:val="FirstParagraph"/>
       </w:pPr>
       <w:r>
-        <w:t>Rehabilitation claim data were extracted from the NDB Open Data No.10 “H_</w:t>
-      </w:r>
-      <w:r>
-        <w:t>リハビリテーション</w:t>
-      </w:r>
-      <w:r>
-        <w:t xml:space="preserve"> </w:t>
-      </w:r>
-      <w:r>
-        <w:rPr>
-          <w:rFonts w:hint="eastAsia"/>
-        </w:rPr>
-        <w:t>都道府県別算定回数／単位数”</w:t>
-      </w:r>
-      <w:r>
-        <w:t xml:space="preserve"> (prefectural rehabilitation claim counts). Five rehabilitation categories were extracted:</w:t>
+        <w:t>Rehabilitation claim data were extracted from the NDB Open Data No.10 "H_Rehabilitation: prefecture-level claim counts and units" (NDB medical-procedure table). Five rehabilitation categories were extracted:</w:t>
       </w:r>
     </w:p>
     <w:p>
@@ -396,7 +352,7 @@
         <w:pStyle w:val="FirstParagraph"/>
       </w:pPr>
       <w:r>
-        <w:t>Hip fracture surgery rates were derived from NDB Open Data No.10 surgical procedure data, extracted in a prior study (NDB_XXX_slope_fracture). Femoral fracture surgery procedures included: K044 (bone fragment removal), K045 (internal fixation), K046 (closed reduction with internal fixation), K081 (femoral head replacement: hemiarthroplasty), and K082 (total hip arthroplasty: THA). Primary outcome was the aggregate hip fracture surgery rate per 100,000 total population. Secondary outcomes included THA-specific (K082) and hemiarthroplasty-specific (K081) rates.</w:t>
+        <w:t>Hip fracture surgery rates were derived from NDB Open Data No.10 surgical procedure tables. Femoral fracture surgery procedures included: K044 (bone fragment removal), K045 (internal fixation), K046 (closed reduction with internal fixation), K081 (femoral head replacement: hemiarthroplasty), and K082 (total hip arthroplasty: THA). Primary outcome was the aggregate hip fracture surgery rate per 100,000 total population. Secondary outcomes included THA-specific (K082) and hemiarthroplasty-specific (K081) rates.</w:t>
       </w:r>
     </w:p>
     <w:p>
@@ -971,15 +927,7 @@
         <w:pStyle w:val="FirstParagraph"/>
       </w:pPr>
       <w:r>
-        <w:t>NDB Open Data No.10 is publicly available at: https://www.mhlw.go.jp/stf/seisakunitsuite/bunya/0000177182.html</w:t>
-      </w:r>
-    </w:p>
-    <w:p>
-      <w:pPr>
-        <w:pStyle w:val="a0"/>
-      </w:pPr>
-      <w:r>
-        <w:t>Analysis scripts are available at: [GitHub repository URL upon acceptance]</w:t>
+        <w:t>Analysis scripts and aggregate prefecture-level datasets are available at https://github.com/haruki00430/spatial-ecological-inference-ndb-japan and on Zenodo (https://doi.org/10.5281/zenodo.20951654). NDB Open Data No.10 is publicly available at: https://www.mhlw.go.jp/stf/seisakunitsuite/bunya/0000177182.html</w:t>
       </w:r>
     </w:p>
     <w:p>

</xml_diff>